<commit_message>
Add HTML summary generation script and initial project summary HTML file
- Created a new script `build-html-summary.js` to generate an HTML document from a Markdown project summary.
- Added a new HTML file `pi-session-2026-08-06T06-18-25-019Z_019fd5b9-177b-7f4a-ac37-0953223e4b26.html` for the project summary.
- The HTML document includes a structured layout with a sidebar navigation, sections for executive summary, architecture overview, processing pipeline, core components, API contracts, infrastructure, extension patterns, rules, dependencies, and code structure.
- Incorporated base64 encoded images for diagrams used in the summary.
</commit_message>
<xml_diff>
--- a/docs/project-summary.docx
+++ b/docs/project-summary.docx
@@ -1035,7 +1035,7 @@
       <w:r>
         <w:drawing>
           <wp:inline distT="0" distB="0" distL="0" distR="0">
-            <wp:extent cx="5524500" cy="3486150"/>
+            <wp:extent cx="5524500" cy="3362325"/>
             <wp:effectExtent t="0" r="0" b="0" l="0"/>
             <wp:docPr id="1" name="" descr="" title=""/>
             <wp:cNvGraphicFramePr>
@@ -1060,7 +1060,7 @@
                   <pic:spPr bwMode="auto">
                     <a:xfrm>
                       <a:off x="0" y="0"/>
-                      <a:ext cx="5524500" cy="3486150"/>
+                      <a:ext cx="5524500" cy="3362325"/>
                     </a:xfrm>
                     <a:prstGeom prst="rect">
                       <a:avLst/>
@@ -2729,7 +2729,7 @@
       <w:r>
         <w:drawing>
           <wp:inline distT="0" distB="0" distL="0" distR="0">
-            <wp:extent cx="5524500" cy="12801600"/>
+            <wp:extent cx="5524500" cy="7620000"/>
             <wp:effectExtent t="0" r="0" b="0" l="0"/>
             <wp:docPr id="1" name="" descr="" title=""/>
             <wp:cNvGraphicFramePr>
@@ -2754,7 +2754,7 @@
                   <pic:spPr bwMode="auto">
                     <a:xfrm>
                       <a:off x="0" y="0"/>
-                      <a:ext cx="5524500" cy="12801600"/>
+                      <a:ext cx="5524500" cy="7620000"/>
                     </a:xfrm>
                     <a:prstGeom prst="rect">
                       <a:avLst/>
@@ -4042,7 +4042,7 @@
       <w:r>
         <w:drawing>
           <wp:inline distT="0" distB="0" distL="0" distR="0">
-            <wp:extent cx="5524500" cy="5057775"/>
+            <wp:extent cx="5524500" cy="4876800"/>
             <wp:effectExtent t="0" r="0" b="0" l="0"/>
             <wp:docPr id="1" name="" descr="" title=""/>
             <wp:cNvGraphicFramePr>
@@ -4067,7 +4067,7 @@
                   <pic:spPr bwMode="auto">
                     <a:xfrm>
                       <a:off x="0" y="0"/>
-                      <a:ext cx="5524500" cy="5057775"/>
+                      <a:ext cx="5524500" cy="4876800"/>
                     </a:xfrm>
                     <a:prstGeom prst="rect">
                       <a:avLst/>
@@ -9878,7 +9878,7 @@
       <w:r>
         <w:drawing>
           <wp:inline distT="0" distB="0" distL="0" distR="0">
-            <wp:extent cx="5524500" cy="4124325"/>
+            <wp:extent cx="5524500" cy="4010025"/>
             <wp:effectExtent t="0" r="0" b="0" l="0"/>
             <wp:docPr id="1" name="" descr="" title=""/>
             <wp:cNvGraphicFramePr>
@@ -9903,7 +9903,7 @@
                   <pic:spPr bwMode="auto">
                     <a:xfrm>
                       <a:off x="0" y="0"/>
-                      <a:ext cx="5524500" cy="4124325"/>
+                      <a:ext cx="5524500" cy="4010025"/>
                     </a:xfrm>
                     <a:prstGeom prst="rect">
                       <a:avLst/>

</xml_diff>